<commit_message>
docs: maj recap + guide synchro maison (exports Excel stylés)
- RECAP : session Excel (helper excelExport, 5 onglets dashboard,
  dependance xlsx-js-style) + ligne Excel dans la stack
- Guide-Sync-Maison-2026-07-16 : ajout des changements Excel, npm install
  desormais requis (nouvelle dependance), fichiers a copier mis a jour

Co-Authored-By: Claude Opus 4.8 <noreply@anthropic.com>
</commit_message>
<xml_diff>
--- a/Guide-Sync-Maison-2026-07-16.docx
+++ b/Guide-Sync-Maison-2026-07-16.docx
@@ -119,10 +119,44 @@
         <w:rPr>
           <w:b/>
         </w:rPr>
-        <w:t xml:space="preserve">Aucune nouvelle dépendance : </w:t>
-      </w:r>
-      <w:r>
-        <w:t xml:space="preserve">aucun paquet npm ajouté.</w:t>
+        <w:t xml:space="preserve">Exports Excel plus soignés : </w:t>
+      </w:r>
+      <w:r>
+        <w:t xml:space="preserve">les fichiers .xlsx exportés (Tableau de bord, Rapports, Candidats) ont maintenant un titre coloré, un en-tête, des lignes zébrées et des colonnes aérées.</w:t>
+      </w:r>
+    </w:p>
+    <w:p>
+      <w:pPr>
+        <w:pStyle w:val="Bullet"/>
+      </w:pPr>
+      <w:r>
+        <w:t xml:space="preserve">•  </w:t>
+      </w:r>
+      <w:r>
+        <w:rPr>
+          <w:b/>
+        </w:rPr>
+        <w:t xml:space="preserve">Tableau de bord — 5 onglets : </w:t>
+      </w:r>
+      <w:r>
+        <w:t xml:space="preserve">l'export inclut désormais KPIs, Candidats, Répartition par expérience, Dernières offres publiées et Sourcing Trend.</w:t>
+      </w:r>
+    </w:p>
+    <w:p>
+      <w:pPr>
+        <w:pStyle w:val="Bullet"/>
+      </w:pPr>
+      <w:r>
+        <w:t xml:space="preserve">•  </w:t>
+      </w:r>
+      <w:r>
+        <w:rPr>
+          <w:b/>
+        </w:rPr>
+        <w:t xml:space="preserve">Nouvelle dépendance (xlsx-js-style) : </w:t>
+      </w:r>
+      <w:r>
+        <w:t xml:space="preserve">elle applique les couleurs/bordures dans l'Excel (l'ancienne lib xlsx ne le faisait pas) — d'où un npm install à faire à la maison (voir partie 4). Chargée à la demande, elle n'alourdit pas le démarrage.</w:t>
       </w:r>
     </w:p>
     <w:p>
@@ -156,7 +190,7 @@
         <w:t xml:space="preserve">Prod déjà à jour : </w:t>
       </w:r>
       <w:r>
-        <w:t xml:space="preserve">commit 350310c poussé et déployé sur Render. Vérifié en ligne (nouveau bundle index-ATTSTaMD.js actif).</w:t>
+        <w:t xml:space="preserve">commits 350310c (photo/OCR) et 0c1ca15 (Excel) poussés et déployés sur Render.</w:t>
       </w:r>
     </w:p>
     <w:p>
@@ -331,6 +365,78 @@
     </w:p>
     <w:p>
       <w:pPr>
+        <w:pStyle w:val="Code"/>
+      </w:pPr>
+      <w:r>
+        <w:rPr>
+          <w:rFonts w:ascii="Consolas" w:hAnsi="Consolas"/>
+          <w:shd w:val="clear" w:fill="EEF2F7"/>
+        </w:rPr>
+        <w:t xml:space="preserve">src/components/DashboardView.tsx</w:t>
+      </w:r>
+    </w:p>
+    <w:p>
+      <w:pPr>
+        <w:pStyle w:val="Code"/>
+      </w:pPr>
+      <w:r>
+        <w:rPr>
+          <w:rFonts w:ascii="Consolas" w:hAnsi="Consolas"/>
+          <w:shd w:val="clear" w:fill="EEF2F7"/>
+        </w:rPr>
+        <w:t xml:space="preserve">src/components/ReportsView.tsx</w:t>
+      </w:r>
+    </w:p>
+    <w:p>
+      <w:pPr>
+        <w:pStyle w:val="Code"/>
+      </w:pPr>
+      <w:r>
+        <w:rPr>
+          <w:rFonts w:ascii="Consolas" w:hAnsi="Consolas"/>
+          <w:shd w:val="clear" w:fill="EEF2F7"/>
+        </w:rPr>
+        <w:t xml:space="preserve">src/components/CandidatesView.tsx</w:t>
+      </w:r>
+    </w:p>
+    <w:p>
+      <w:pPr>
+        <w:pStyle w:val="Code"/>
+      </w:pPr>
+      <w:r>
+        <w:rPr>
+          <w:rFonts w:ascii="Consolas" w:hAnsi="Consolas"/>
+          <w:shd w:val="clear" w:fill="EEF2F7"/>
+        </w:rPr>
+        <w:t xml:space="preserve">src/lib/excelExport.ts</w:t>
+      </w:r>
+    </w:p>
+    <w:p>
+      <w:pPr>
+        <w:pStyle w:val="Code"/>
+      </w:pPr>
+      <w:r>
+        <w:rPr>
+          <w:rFonts w:ascii="Consolas" w:hAnsi="Consolas"/>
+          <w:shd w:val="clear" w:fill="EEF2F7"/>
+        </w:rPr>
+        <w:t xml:space="preserve">vite.config.ts</w:t>
+      </w:r>
+    </w:p>
+    <w:p>
+      <w:pPr>
+        <w:pStyle w:val="Code"/>
+      </w:pPr>
+      <w:r>
+        <w:rPr>
+          <w:rFonts w:ascii="Consolas" w:hAnsi="Consolas"/>
+          <w:shd w:val="clear" w:fill="EEF2F7"/>
+        </w:rPr>
+        <w:t xml:space="preserve">package.json  +  package-lock.json  (pour la nouvelle dépendance)</w:t>
+      </w:r>
+    </w:p>
+    <w:p>
+      <w:pPr>
         <w:pStyle w:val="Heading2"/>
       </w:pPr>
       <w:r>
@@ -413,10 +519,10 @@
         <w:rPr>
           <w:b/>
         </w:rPr>
-        <w:t xml:space="preserve">Bonne nouvelle : aujourd'hui, pas de migration ni de re-seed. </w:t>
-      </w:r>
-      <w:r>
-        <w:t xml:space="preserve">Les changements sont uniquement du code (front + serveur).</w:t>
+        <w:t xml:space="preserve">Pas de migration ni de re-seed aujourd'hui, </w:t>
+      </w:r>
+      <w:r>
+        <w:t xml:space="preserve">mais une nouvelle dépendance a été ajoutée (xlsx-js-style, pour l'Excel).</w:t>
       </w:r>
     </w:p>
     <w:p>
@@ -430,7 +536,7 @@
         <w:t xml:space="preserve">1. </w:t>
       </w:r>
       <w:r>
-        <w:t xml:space="preserve">Installer les dépendances (aucune nouvelle aujourd'hui, mais la commande reste sans risque) :</w:t>
+        <w:t xml:space="preserve">Installer les dépendances — INDISPENSABLE cette fois (nouvelle dépendance) :</w:t>
       </w:r>
     </w:p>
     <w:p>
@@ -645,10 +751,10 @@
         <w:rPr>
           <w:b/>
         </w:rPr>
-        <w:t xml:space="preserve">Pas de nouvelle dépendance : </w:t>
-      </w:r>
-      <w:r>
-        <w:t xml:space="preserve">l'OCR réutilise Gemini, déjà installé.</w:t>
+        <w:t xml:space="preserve">OCR sans installation : </w:t>
+      </w:r>
+      <w:r>
+        <w:t xml:space="preserve">la lecture des CV image réutilise Gemini, déjà présent (seul xlsx-js-style, pour l'Excel, est une nouvelle dépendance — d'où le npm install de la partie 4).</w:t>
       </w:r>
     </w:p>
     <w:p>
@@ -665,7 +771,7 @@
         <w:t xml:space="preserve">Rien à faire côté production : </w:t>
       </w:r>
       <w:r>
-        <w:t xml:space="preserve">Render est déjà déployé et vérifié.</w:t>
+        <w:t xml:space="preserve">Render redéploie automatiquement à chaque push.</w:t>
       </w:r>
     </w:p>
     <w:p>
@@ -754,6 +860,23 @@
     </w:p>
     <w:p>
       <w:pPr>
+        <w:pStyle w:val="Bullet"/>
+      </w:pPr>
+      <w:r>
+        <w:t xml:space="preserve">•  </w:t>
+      </w:r>
+      <w:r>
+        <w:rPr>
+          <w:b/>
+        </w:rPr>
+        <w:t xml:space="preserve">Export Excel : </w:t>
+      </w:r>
+      <w:r>
+        <w:t xml:space="preserve">dans Tableau de bord et Rapports, le bouton d'export .xlsx produit un fichier coloré et aéré ; l'export du Tableau de bord contient 5 onglets (dont Répartition par expérience et Offres publiées).</w:t>
+      </w:r>
+    </w:p>
+    <w:p>
+      <w:pPr>
         <w:pStyle w:val="Body"/>
       </w:pPr>
       <w:r>
@@ -834,6 +957,23 @@
       </w:r>
       <w:r>
         <w:t xml:space="preserve">les fichiers reçus sont traités en mémoire (plus d'écriture sur le disque) : CV/lettre extraits en texte, photo encodée en base64.</w:t>
+      </w:r>
+    </w:p>
+    <w:p>
+      <w:pPr>
+        <w:pStyle w:val="Bullet"/>
+      </w:pPr>
+      <w:r>
+        <w:t xml:space="preserve">•  </w:t>
+      </w:r>
+      <w:r>
+        <w:rPr>
+          <w:b/>
+        </w:rPr>
+        <w:t xml:space="preserve">Excel — chargé à la demande : </w:t>
+      </w:r>
+      <w:r>
+        <w:t xml:space="preserve">la lib xlsx-js-style ne se télécharge qu'au clic sur « Exporter » ; le démarrage de l'app reste léger.</w:t>
       </w:r>
     </w:p>
     <w:p>

</xml_diff>